<commit_message>
V18: Settled most of Errata v3 (except tempi and text)
</commit_message>
<xml_diff>
--- a/Proof Reading and Review/LARA Bonecas Russas - Errata_v3 (129-136, 145-160, 191-207).docx
+++ b/Proof Reading and Review/LARA Bonecas Russas - Errata_v3 (129-136, 145-160, 191-207).docx
@@ -475,6 +475,12 @@
                 <w:rFonts w:ascii="Times" w:eastAsia="Times" w:hAnsi="Times" w:cs="Times"/>
               </w:rPr>
             </w:pPr>
+            <w:r>
+              <w:rPr>
+                <w:rFonts w:ascii="Times" w:eastAsia="Times" w:hAnsi="Times" w:cs="Times"/>
+              </w:rPr>
+              <w:t>YES</w:t>
+            </w:r>
           </w:p>
         </w:tc>
       </w:tr>
@@ -546,11 +552,23 @@
           </w:tcPr>
           <w:p>
             <w:pPr>
+              <w:pStyle w:val="ListParagraph"/>
+              <w:numPr>
+                <w:ilvl w:val="0"/>
+                <w:numId w:val="4"/>
+              </w:numPr>
               <w:rPr>
                 <w:rFonts w:ascii="Times" w:eastAsia="Times" w:hAnsi="Times" w:cs="Times"/>
                 <w:color w:val="FF0000"/>
               </w:rPr>
             </w:pPr>
+            <w:r>
+              <w:rPr>
+                <w:rFonts w:ascii="Times" w:eastAsia="Times" w:hAnsi="Times" w:cs="Times"/>
+                <w:color w:val="FF0000"/>
+              </w:rPr>
+              <w:t>See Below</w:t>
+            </w:r>
           </w:p>
         </w:tc>
       </w:tr>
@@ -630,6 +648,12 @@
                 <w:rFonts w:ascii="Times" w:eastAsia="Times" w:hAnsi="Times" w:cs="Times"/>
               </w:rPr>
             </w:pPr>
+            <w:r>
+              <w:rPr>
+                <w:rFonts w:ascii="Times" w:eastAsia="Times" w:hAnsi="Times" w:cs="Times"/>
+              </w:rPr>
+              <w:t>YES</w:t>
+            </w:r>
           </w:p>
         </w:tc>
       </w:tr>
@@ -732,6 +756,12 @@
                 <w:rFonts w:ascii="Times" w:eastAsia="Times" w:hAnsi="Times" w:cs="Times"/>
               </w:rPr>
             </w:pPr>
+            <w:r>
+              <w:rPr>
+                <w:rFonts w:ascii="Times" w:eastAsia="Times" w:hAnsi="Times" w:cs="Times"/>
+              </w:rPr>
+              <w:t>YES</w:t>
+            </w:r>
           </w:p>
         </w:tc>
       </w:tr>
@@ -807,6 +837,12 @@
                 <w:rFonts w:ascii="Times" w:eastAsia="Times" w:hAnsi="Times" w:cs="Times"/>
               </w:rPr>
             </w:pPr>
+            <w:r>
+              <w:rPr>
+                <w:rFonts w:ascii="Times" w:eastAsia="Times" w:hAnsi="Times" w:cs="Times"/>
+              </w:rPr>
+              <w:t>YES</w:t>
+            </w:r>
           </w:p>
         </w:tc>
       </w:tr>
@@ -823,11 +859,15 @@
             <w:pPr>
               <w:rPr>
                 <w:rFonts w:ascii="Times" w:eastAsia="Times" w:hAnsi="Times" w:cs="Times"/>
-              </w:rPr>
-            </w:pPr>
-            <w:r>
-              <w:rPr>
-                <w:rFonts w:ascii="Times" w:eastAsia="Times" w:hAnsi="Times" w:cs="Times"/>
+                <w:b/>
+                <w:bCs/>
+              </w:rPr>
+            </w:pPr>
+            <w:r>
+              <w:rPr>
+                <w:rFonts w:ascii="Times" w:eastAsia="Times" w:hAnsi="Times" w:cs="Times"/>
+                <w:b/>
+                <w:bCs/>
               </w:rPr>
               <w:t>All</w:t>
             </w:r>
@@ -842,11 +882,15 @@
             <w:pPr>
               <w:rPr>
                 <w:rFonts w:ascii="Times" w:eastAsia="Times" w:hAnsi="Times" w:cs="Times"/>
-              </w:rPr>
-            </w:pPr>
-            <w:r>
-              <w:rPr>
-                <w:rFonts w:ascii="Times" w:eastAsia="Times" w:hAnsi="Times" w:cs="Times"/>
+                <w:b/>
+                <w:bCs/>
+              </w:rPr>
+            </w:pPr>
+            <w:r>
+              <w:rPr>
+                <w:rFonts w:ascii="Times" w:eastAsia="Times" w:hAnsi="Times" w:cs="Times"/>
+                <w:b/>
+                <w:bCs/>
               </w:rPr>
               <w:t>193-197</w:t>
             </w:r>
@@ -861,11 +905,15 @@
             <w:pPr>
               <w:rPr>
                 <w:rFonts w:ascii="Times" w:eastAsia="Times" w:hAnsi="Times" w:cs="Times"/>
-              </w:rPr>
-            </w:pPr>
-            <w:r>
-              <w:rPr>
-                <w:rFonts w:ascii="Times" w:eastAsia="Times" w:hAnsi="Times" w:cs="Times"/>
+                <w:b/>
+                <w:bCs/>
+              </w:rPr>
+            </w:pPr>
+            <w:r>
+              <w:rPr>
+                <w:rFonts w:ascii="Times" w:eastAsia="Times" w:hAnsi="Times" w:cs="Times"/>
+                <w:b/>
+                <w:bCs/>
               </w:rPr>
               <w:t>I’ve put the rit. in the traditional style but I can also do the arrow style you have in the manuscript. Let me know if you prefer that or are okay with this.</w:t>
             </w:r>
@@ -880,8 +928,18 @@
             <w:pPr>
               <w:rPr>
                 <w:rFonts w:ascii="Times" w:eastAsia="Times" w:hAnsi="Times" w:cs="Times"/>
-              </w:rPr>
-            </w:pPr>
+                <w:b/>
+                <w:bCs/>
+              </w:rPr>
+            </w:pPr>
+            <w:r>
+              <w:rPr>
+                <w:rFonts w:ascii="Times" w:eastAsia="Times" w:hAnsi="Times" w:cs="Times"/>
+                <w:b/>
+                <w:bCs/>
+              </w:rPr>
+              <w:t>I prefer my arrows</w:t>
+            </w:r>
           </w:p>
         </w:tc>
       </w:tr>
@@ -963,6 +1021,12 @@
                 <w:rFonts w:ascii="Times" w:eastAsia="Times" w:hAnsi="Times" w:cs="Times"/>
               </w:rPr>
             </w:pPr>
+            <w:r>
+              <w:rPr>
+                <w:rFonts w:ascii="Times" w:eastAsia="Times" w:hAnsi="Times" w:cs="Times"/>
+              </w:rPr>
+              <w:t>3 seconds</w:t>
+            </w:r>
           </w:p>
         </w:tc>
       </w:tr>
@@ -1038,6 +1102,12 @@
                 <w:rFonts w:ascii="Times" w:eastAsia="Times" w:hAnsi="Times" w:cs="Times"/>
               </w:rPr>
             </w:pPr>
+            <w:r>
+              <w:rPr>
+                <w:rFonts w:ascii="Times" w:eastAsia="Times" w:hAnsi="Times" w:cs="Times"/>
+              </w:rPr>
+              <w:t>YES</w:t>
+            </w:r>
           </w:p>
         </w:tc>
       </w:tr>
@@ -1056,19 +1126,556 @@
     </w:p>
     <w:p>
       <w:pPr>
+        <w:pStyle w:val="ListParagraph"/>
+        <w:numPr>
+          <w:ilvl w:val="0"/>
+          <w:numId w:val="4"/>
+        </w:numPr>
         <w:rPr>
           <w:b/>
           <w:bCs/>
           <w:color w:val="FF0000"/>
-        </w:rPr>
-      </w:pPr>
-    </w:p>
-    <w:p>
-      <w:pPr>
+          <w:lang w:val="pt-BR"/>
+        </w:rPr>
+      </w:pPr>
+      <w:r>
         <w:rPr>
           <w:b/>
           <w:bCs/>
           <w:color w:val="FF0000"/>
+          <w:lang w:val="pt-BR"/>
+        </w:rPr>
+        <w:t>Song</w:t>
+      </w:r>
+      <w:r>
+        <w:rPr>
+          <w:b/>
+          <w:bCs/>
+          <w:color w:val="FF0000"/>
+          <w:lang w:val="pt-BR"/>
+        </w:rPr>
+        <w:br/>
+      </w:r>
+    </w:p>
+    <w:p>
+      <w:pPr>
+        <w:pStyle w:val="ListParagraph"/>
+        <w:rPr>
+          <w:color w:val="FF0000"/>
+          <w:lang w:val="pt-BR"/>
+        </w:rPr>
+      </w:pPr>
+      <w:r>
+        <w:rPr>
+          <w:color w:val="FF0000"/>
+          <w:lang w:val="pt-BR"/>
+        </w:rPr>
+        <w:t>Com olho dentro dos olhos observo teu corpo de manhã; com dedos dentro dos dedos toquei você ontem a noite. Minha saliva antiga bebeu a tua, não a nova, e em minha raiva foi meu veneno velho, copiado, diluído, que se lançou contra todos.</w:t>
+      </w:r>
+    </w:p>
+    <w:p>
+      <w:pPr>
+        <w:pStyle w:val="ListParagraph"/>
+        <w:rPr>
+          <w:color w:val="FF0000"/>
+          <w:lang w:val="pt-BR"/>
+        </w:rPr>
+      </w:pPr>
+    </w:p>
+    <w:p>
+      <w:pPr>
+        <w:pStyle w:val="ListParagraph"/>
+        <w:rPr>
+          <w:i/>
+          <w:iCs/>
+          <w:color w:val="FF0000"/>
+        </w:rPr>
+      </w:pPr>
+      <w:r>
+        <w:rPr>
+          <w:i/>
+          <w:iCs/>
+          <w:color w:val="FF0000"/>
+        </w:rPr>
+        <w:t>"With eye within eyes, I observe your body in the morning; with finger within fingers, I touched you last night. My old saliva drank yours, not the new one, and in my wrath was old poison, copied, diluted, which launched itself against all "</w:t>
+      </w:r>
+    </w:p>
+    <w:p>
+      <w:pPr>
+        <w:pStyle w:val="ListParagraph"/>
+        <w:rPr>
+          <w:b/>
+          <w:bCs/>
+          <w:color w:val="FF0000"/>
+        </w:rPr>
+      </w:pPr>
+    </w:p>
+    <w:p>
+      <w:pPr>
+        <w:rPr>
+          <w:b/>
+          <w:bCs/>
+        </w:rPr>
+      </w:pPr>
+      <w:r>
+        <w:rPr>
+          <w:b/>
+          <w:bCs/>
+        </w:rPr>
+        <w:lastRenderedPageBreak/>
+        <w:t>ADDITIONAL ERRATA – BATCH 3</w:t>
+      </w:r>
+    </w:p>
+    <w:p>
+      <w:pPr>
+        <w:rPr>
+          <w:b/>
+          <w:bCs/>
+        </w:rPr>
+      </w:pPr>
+    </w:p>
+    <w:p>
+      <w:pPr>
+        <w:rPr>
+          <w:b/>
+          <w:bCs/>
+        </w:rPr>
+      </w:pPr>
+    </w:p>
+    <w:p>
+      <w:pPr>
+        <w:rPr>
+          <w:b/>
+          <w:bCs/>
+        </w:rPr>
+      </w:pPr>
+    </w:p>
+    <w:p>
+      <w:pPr>
+        <w:pStyle w:val="ListParagraph"/>
+        <w:numPr>
+          <w:ilvl w:val="0"/>
+          <w:numId w:val="5"/>
+        </w:numPr>
+      </w:pPr>
+      <w:r>
+        <w:t xml:space="preserve">M128 – </w:t>
+      </w:r>
+      <w:proofErr w:type="spellStart"/>
+      <w:r>
+        <w:t>bcl</w:t>
+      </w:r>
+      <w:proofErr w:type="spellEnd"/>
+      <w:r>
+        <w:t>, beat 4 – last note is on the wrong octave</w:t>
+      </w:r>
+      <w:proofErr w:type="gramStart"/>
+      <w:r>
+        <w:t>….Eb</w:t>
+      </w:r>
+      <w:proofErr w:type="gramEnd"/>
+      <w:r>
+        <w:t xml:space="preserve"> should be an octave below</w:t>
+      </w:r>
+    </w:p>
+    <w:p>
+      <w:pPr>
+        <w:rPr>
+          <w:b/>
+          <w:bCs/>
+        </w:rPr>
+      </w:pPr>
+    </w:p>
+    <w:p>
+      <w:pPr>
+        <w:pStyle w:val="ListParagraph"/>
+        <w:numPr>
+          <w:ilvl w:val="0"/>
+          <w:numId w:val="5"/>
+        </w:numPr>
+      </w:pPr>
+      <w:r>
+        <w:t xml:space="preserve">M128, </w:t>
+      </w:r>
+      <w:proofErr w:type="spellStart"/>
+      <w:r>
+        <w:t>tbn</w:t>
+      </w:r>
+      <w:proofErr w:type="spellEnd"/>
+      <w:r>
+        <w:t>, beat 4 – change spelling from G# to Ab</w:t>
+      </w:r>
+      <w:r>
+        <w:br/>
+      </w:r>
+    </w:p>
+    <w:p>
+      <w:pPr>
+        <w:pStyle w:val="ListParagraph"/>
+        <w:numPr>
+          <w:ilvl w:val="0"/>
+          <w:numId w:val="5"/>
+        </w:numPr>
+      </w:pPr>
+      <w:r>
+        <w:t xml:space="preserve">M129, </w:t>
+      </w:r>
+      <w:proofErr w:type="spellStart"/>
+      <w:proofErr w:type="gramStart"/>
+      <w:r>
+        <w:t>bcl</w:t>
+      </w:r>
+      <w:proofErr w:type="spellEnd"/>
+      <w:r>
+        <w:t xml:space="preserve"> ,</w:t>
+      </w:r>
+      <w:proofErr w:type="gramEnd"/>
+      <w:r>
+        <w:t xml:space="preserve"> beat 3 missing natural; beat 4, wrong octave C1/4 flat should be one octave above</w:t>
+      </w:r>
+      <w:r>
+        <w:br/>
+      </w:r>
+    </w:p>
+    <w:p>
+      <w:pPr>
+        <w:pStyle w:val="ListParagraph"/>
+        <w:numPr>
+          <w:ilvl w:val="0"/>
+          <w:numId w:val="5"/>
+        </w:numPr>
+      </w:pPr>
+      <w:r>
+        <w:t xml:space="preserve">M129, </w:t>
+      </w:r>
+      <w:proofErr w:type="spellStart"/>
+      <w:r>
+        <w:t>tpt</w:t>
+      </w:r>
+      <w:proofErr w:type="spellEnd"/>
+      <w:r>
+        <w:t>, beat 3, note has not been transposed…should be A ¼ flat</w:t>
+      </w:r>
+    </w:p>
+    <w:p>
+      <w:pPr>
+        <w:rPr>
+          <w:b/>
+          <w:bCs/>
+        </w:rPr>
+      </w:pPr>
+    </w:p>
+    <w:p>
+      <w:pPr>
+        <w:pStyle w:val="ListParagraph"/>
+        <w:numPr>
+          <w:ilvl w:val="0"/>
+          <w:numId w:val="5"/>
+        </w:numPr>
+      </w:pPr>
+      <w:r>
+        <w:t xml:space="preserve">M131, </w:t>
+      </w:r>
+      <w:proofErr w:type="spellStart"/>
+      <w:r>
+        <w:t>tpt</w:t>
+      </w:r>
+      <w:proofErr w:type="spellEnd"/>
+      <w:r>
+        <w:t>, beat 1, wrong transposition, should be A natural</w:t>
+      </w:r>
+      <w:proofErr w:type="gramStart"/>
+      <w:r>
+        <w:t>….also</w:t>
+      </w:r>
+      <w:proofErr w:type="gramEnd"/>
+      <w:r>
+        <w:t xml:space="preserve"> beat 2 wrong transposition, should be C# 1/6 flat</w:t>
+      </w:r>
+    </w:p>
+    <w:p>
+      <w:pPr>
+        <w:pStyle w:val="ListParagraph"/>
+        <w:rPr>
+          <w:b/>
+          <w:bCs/>
+        </w:rPr>
+      </w:pPr>
+    </w:p>
+    <w:p>
+      <w:pPr>
+        <w:pStyle w:val="ListParagraph"/>
+        <w:numPr>
+          <w:ilvl w:val="0"/>
+          <w:numId w:val="5"/>
+        </w:numPr>
+      </w:pPr>
+      <w:r>
+        <w:t xml:space="preserve">M133, </w:t>
+      </w:r>
+      <w:proofErr w:type="spellStart"/>
+      <w:r>
+        <w:t>tpt</w:t>
+      </w:r>
+      <w:proofErr w:type="spellEnd"/>
+      <w:r>
+        <w:t>, “</w:t>
+      </w:r>
+      <w:proofErr w:type="spellStart"/>
+      <w:r>
+        <w:t>ord</w:t>
+      </w:r>
+      <w:proofErr w:type="spellEnd"/>
+      <w:r>
+        <w:t xml:space="preserve">” </w:t>
+      </w:r>
+      <w:proofErr w:type="gramStart"/>
+      <w:r>
+        <w:t>text  is</w:t>
+      </w:r>
+      <w:proofErr w:type="gramEnd"/>
+      <w:r>
+        <w:t xml:space="preserve"> chopped</w:t>
+      </w:r>
+    </w:p>
+    <w:p>
+      <w:pPr>
+        <w:pStyle w:val="ListParagraph"/>
+        <w:rPr>
+          <w:b/>
+          <w:bCs/>
+        </w:rPr>
+      </w:pPr>
+    </w:p>
+    <w:p>
+      <w:pPr>
+        <w:pStyle w:val="ListParagraph"/>
+        <w:numPr>
+          <w:ilvl w:val="0"/>
+          <w:numId w:val="5"/>
+        </w:numPr>
+      </w:pPr>
+      <w:r>
+        <w:t>M135, voice, beat 3, note from text “-no” should not be tied, is a new attack</w:t>
+      </w:r>
+    </w:p>
+    <w:p>
+      <w:pPr>
+        <w:pStyle w:val="ListParagraph"/>
+        <w:rPr>
+          <w:b/>
+          <w:bCs/>
+        </w:rPr>
+      </w:pPr>
+    </w:p>
+    <w:p>
+      <w:pPr>
+        <w:pStyle w:val="ListParagraph"/>
+        <w:numPr>
+          <w:ilvl w:val="0"/>
+          <w:numId w:val="5"/>
+        </w:numPr>
+      </w:pPr>
+      <w:r>
+        <w:t xml:space="preserve">M150, </w:t>
+      </w:r>
+      <w:proofErr w:type="spellStart"/>
+      <w:r>
+        <w:t>tpt</w:t>
+      </w:r>
+      <w:proofErr w:type="spellEnd"/>
+      <w:r>
+        <w:t xml:space="preserve">, beat 3, F missing natural </w:t>
+      </w:r>
+    </w:p>
+    <w:p>
+      <w:pPr>
+        <w:pStyle w:val="ListParagraph"/>
+        <w:rPr>
+          <w:b/>
+          <w:bCs/>
+        </w:rPr>
+      </w:pPr>
+    </w:p>
+    <w:p>
+      <w:pPr>
+        <w:pStyle w:val="ListParagraph"/>
+        <w:numPr>
+          <w:ilvl w:val="0"/>
+          <w:numId w:val="5"/>
+        </w:numPr>
+      </w:pPr>
+      <w:r>
+        <w:t xml:space="preserve">M155, </w:t>
+      </w:r>
+      <w:proofErr w:type="spellStart"/>
+      <w:r>
+        <w:t>tpt</w:t>
+      </w:r>
+      <w:proofErr w:type="spellEnd"/>
+      <w:r>
+        <w:t>, beat 1 – wrong transposition, should be C natural</w:t>
+      </w:r>
+      <w:r>
+        <w:t>; grace note also wrong, should be F ¼ sharp</w:t>
+      </w:r>
+    </w:p>
+    <w:p>
+      <w:pPr>
+        <w:pStyle w:val="ListParagraph"/>
+        <w:rPr>
+          <w:b/>
+          <w:bCs/>
+        </w:rPr>
+      </w:pPr>
+    </w:p>
+    <w:p>
+      <w:pPr>
+        <w:pStyle w:val="ListParagraph"/>
+        <w:numPr>
+          <w:ilvl w:val="0"/>
+          <w:numId w:val="5"/>
+        </w:numPr>
+      </w:pPr>
+      <w:r>
+        <w:t xml:space="preserve">M156, </w:t>
+      </w:r>
+      <w:proofErr w:type="spellStart"/>
+      <w:r>
+        <w:t>tpt</w:t>
+      </w:r>
+      <w:proofErr w:type="spellEnd"/>
+      <w:r>
+        <w:t>, beats 1 and 2 both missing 1/6 flat to their accidentals</w:t>
+      </w:r>
+    </w:p>
+    <w:p>
+      <w:pPr>
+        <w:pStyle w:val="ListParagraph"/>
+        <w:rPr>
+          <w:b/>
+          <w:bCs/>
+        </w:rPr>
+      </w:pPr>
+    </w:p>
+    <w:p>
+      <w:pPr>
+        <w:pStyle w:val="ListParagraph"/>
+        <w:numPr>
+          <w:ilvl w:val="0"/>
+          <w:numId w:val="5"/>
+        </w:numPr>
+      </w:pPr>
+      <w:r>
+        <w:t xml:space="preserve">M157, </w:t>
+      </w:r>
+      <w:proofErr w:type="spellStart"/>
+      <w:r>
+        <w:t>tpt</w:t>
+      </w:r>
+      <w:proofErr w:type="spellEnd"/>
+      <w:r>
+        <w:t>, missing dynamics</w:t>
+      </w:r>
+    </w:p>
+    <w:p>
+      <w:pPr>
+        <w:pStyle w:val="ListParagraph"/>
+        <w:rPr>
+          <w:b/>
+          <w:bCs/>
+        </w:rPr>
+      </w:pPr>
+    </w:p>
+    <w:p>
+      <w:pPr>
+        <w:pStyle w:val="ListParagraph"/>
+        <w:numPr>
+          <w:ilvl w:val="0"/>
+          <w:numId w:val="5"/>
+        </w:numPr>
+      </w:pPr>
+      <w:r>
+        <w:t xml:space="preserve">M159, </w:t>
+      </w:r>
+      <w:proofErr w:type="spellStart"/>
+      <w:r>
+        <w:t>bcl</w:t>
+      </w:r>
+      <w:proofErr w:type="spellEnd"/>
+      <w:r>
+        <w:t>, beat 3, clean up mf from crescendo clash</w:t>
+      </w:r>
+    </w:p>
+    <w:p>
+      <w:pPr>
+        <w:pStyle w:val="ListParagraph"/>
+        <w:rPr>
+          <w:b/>
+          <w:bCs/>
+        </w:rPr>
+      </w:pPr>
+    </w:p>
+    <w:p>
+      <w:pPr>
+        <w:pStyle w:val="ListParagraph"/>
+        <w:numPr>
+          <w:ilvl w:val="0"/>
+          <w:numId w:val="5"/>
+        </w:numPr>
+      </w:pPr>
+      <w:r>
+        <w:t>From M193-197, voice, add text “</w:t>
+      </w:r>
+      <w:proofErr w:type="spellStart"/>
+      <w:r>
+        <w:t>tototo</w:t>
+      </w:r>
+      <w:proofErr w:type="spellEnd"/>
+      <w:r>
+        <w:t>…” under every group</w:t>
+      </w:r>
+    </w:p>
+    <w:p>
+      <w:pPr>
+        <w:pStyle w:val="ListParagraph"/>
+        <w:rPr>
+          <w:b/>
+          <w:bCs/>
+        </w:rPr>
+      </w:pPr>
+    </w:p>
+    <w:p>
+      <w:pPr>
+        <w:pStyle w:val="ListParagraph"/>
+        <w:numPr>
+          <w:ilvl w:val="0"/>
+          <w:numId w:val="5"/>
+        </w:numPr>
+      </w:pPr>
+      <w:r>
+        <w:t>M193-19</w:t>
+      </w:r>
+      <w:r>
+        <w:t>4</w:t>
+      </w:r>
+      <w:r>
+        <w:t xml:space="preserve">, </w:t>
+      </w:r>
+      <w:proofErr w:type="spellStart"/>
+      <w:r>
+        <w:t>tpt</w:t>
+      </w:r>
+      <w:proofErr w:type="spellEnd"/>
+      <w:r>
+        <w:t>, all notes are wrong…transposition should be C ¼ flat</w:t>
+      </w:r>
+    </w:p>
+    <w:p>
+      <w:pPr>
+        <w:rPr>
+          <w:b/>
+          <w:bCs/>
         </w:rPr>
       </w:pPr>
     </w:p>
@@ -1206,6 +1813,119 @@
     </w:lvl>
   </w:abstractNum>
   <w:abstractNum w:abstractNumId="1" w15:restartNumberingAfterBreak="0">
+    <w:nsid w:val="13A6088E"/>
+    <w:multiLevelType w:val="hybridMultilevel"/>
+    <w:tmpl w:val="65C484AA"/>
+    <w:lvl w:ilvl="0" w:tplc="83BEA924">
+      <w:start w:val="3"/>
+      <w:numFmt w:val="bullet"/>
+      <w:lvlText w:val="-"/>
+      <w:lvlJc w:val="left"/>
+      <w:pPr>
+        <w:ind w:left="720" w:hanging="360"/>
+      </w:pPr>
+      <w:rPr>
+        <w:rFonts w:ascii="Aptos" w:eastAsiaTheme="minorHAnsi" w:hAnsi="Aptos" w:cstheme="minorBidi" w:hint="default"/>
+      </w:rPr>
+    </w:lvl>
+    <w:lvl w:ilvl="1" w:tplc="04090003" w:tentative="1">
+      <w:start w:val="1"/>
+      <w:numFmt w:val="bullet"/>
+      <w:lvlText w:val="o"/>
+      <w:lvlJc w:val="left"/>
+      <w:pPr>
+        <w:ind w:left="1440" w:hanging="360"/>
+      </w:pPr>
+      <w:rPr>
+        <w:rFonts w:ascii="Courier New" w:hAnsi="Courier New" w:cs="Courier New" w:hint="default"/>
+      </w:rPr>
+    </w:lvl>
+    <w:lvl w:ilvl="2" w:tplc="04090005" w:tentative="1">
+      <w:start w:val="1"/>
+      <w:numFmt w:val="bullet"/>
+      <w:lvlText w:val=""/>
+      <w:lvlJc w:val="left"/>
+      <w:pPr>
+        <w:ind w:left="2160" w:hanging="360"/>
+      </w:pPr>
+      <w:rPr>
+        <w:rFonts w:ascii="Wingdings" w:hAnsi="Wingdings" w:hint="default"/>
+      </w:rPr>
+    </w:lvl>
+    <w:lvl w:ilvl="3" w:tplc="04090001" w:tentative="1">
+      <w:start w:val="1"/>
+      <w:numFmt w:val="bullet"/>
+      <w:lvlText w:val=""/>
+      <w:lvlJc w:val="left"/>
+      <w:pPr>
+        <w:ind w:left="2880" w:hanging="360"/>
+      </w:pPr>
+      <w:rPr>
+        <w:rFonts w:ascii="Symbol" w:hAnsi="Symbol" w:hint="default"/>
+      </w:rPr>
+    </w:lvl>
+    <w:lvl w:ilvl="4" w:tplc="04090003" w:tentative="1">
+      <w:start w:val="1"/>
+      <w:numFmt w:val="bullet"/>
+      <w:lvlText w:val="o"/>
+      <w:lvlJc w:val="left"/>
+      <w:pPr>
+        <w:ind w:left="3600" w:hanging="360"/>
+      </w:pPr>
+      <w:rPr>
+        <w:rFonts w:ascii="Courier New" w:hAnsi="Courier New" w:cs="Courier New" w:hint="default"/>
+      </w:rPr>
+    </w:lvl>
+    <w:lvl w:ilvl="5" w:tplc="04090005" w:tentative="1">
+      <w:start w:val="1"/>
+      <w:numFmt w:val="bullet"/>
+      <w:lvlText w:val=""/>
+      <w:lvlJc w:val="left"/>
+      <w:pPr>
+        <w:ind w:left="4320" w:hanging="360"/>
+      </w:pPr>
+      <w:rPr>
+        <w:rFonts w:ascii="Wingdings" w:hAnsi="Wingdings" w:hint="default"/>
+      </w:rPr>
+    </w:lvl>
+    <w:lvl w:ilvl="6" w:tplc="04090001" w:tentative="1">
+      <w:start w:val="1"/>
+      <w:numFmt w:val="bullet"/>
+      <w:lvlText w:val=""/>
+      <w:lvlJc w:val="left"/>
+      <w:pPr>
+        <w:ind w:left="5040" w:hanging="360"/>
+      </w:pPr>
+      <w:rPr>
+        <w:rFonts w:ascii="Symbol" w:hAnsi="Symbol" w:hint="default"/>
+      </w:rPr>
+    </w:lvl>
+    <w:lvl w:ilvl="7" w:tplc="04090003" w:tentative="1">
+      <w:start w:val="1"/>
+      <w:numFmt w:val="bullet"/>
+      <w:lvlText w:val="o"/>
+      <w:lvlJc w:val="left"/>
+      <w:pPr>
+        <w:ind w:left="5760" w:hanging="360"/>
+      </w:pPr>
+      <w:rPr>
+        <w:rFonts w:ascii="Courier New" w:hAnsi="Courier New" w:cs="Courier New" w:hint="default"/>
+      </w:rPr>
+    </w:lvl>
+    <w:lvl w:ilvl="8" w:tplc="04090005" w:tentative="1">
+      <w:start w:val="1"/>
+      <w:numFmt w:val="bullet"/>
+      <w:lvlText w:val=""/>
+      <w:lvlJc w:val="left"/>
+      <w:pPr>
+        <w:ind w:left="6480" w:hanging="360"/>
+      </w:pPr>
+      <w:rPr>
+        <w:rFonts w:ascii="Wingdings" w:hAnsi="Wingdings" w:hint="default"/>
+      </w:rPr>
+    </w:lvl>
+  </w:abstractNum>
+  <w:abstractNum w:abstractNumId="2" w15:restartNumberingAfterBreak="0">
     <w:nsid w:val="18BB7A26"/>
     <w:multiLevelType w:val="hybridMultilevel"/>
     <w:tmpl w:val="27B6F5B2"/>
@@ -1294,7 +2014,119 @@
       </w:pPr>
     </w:lvl>
   </w:abstractNum>
-  <w:abstractNum w:abstractNumId="2" w15:restartNumberingAfterBreak="0">
+  <w:abstractNum w:abstractNumId="3" w15:restartNumberingAfterBreak="0">
+    <w:nsid w:val="5BD37D07"/>
+    <w:multiLevelType w:val="hybridMultilevel"/>
+    <w:tmpl w:val="333034B4"/>
+    <w:lvl w:ilvl="0" w:tplc="E48A4226">
+      <w:numFmt w:val="bullet"/>
+      <w:lvlText w:val=""/>
+      <w:lvlJc w:val="left"/>
+      <w:pPr>
+        <w:ind w:left="720" w:hanging="360"/>
+      </w:pPr>
+      <w:rPr>
+        <w:rFonts w:ascii="Symbol" w:eastAsia="Times" w:hAnsi="Symbol" w:cs="Times" w:hint="default"/>
+      </w:rPr>
+    </w:lvl>
+    <w:lvl w:ilvl="1" w:tplc="04090003" w:tentative="1">
+      <w:start w:val="1"/>
+      <w:numFmt w:val="bullet"/>
+      <w:lvlText w:val="o"/>
+      <w:lvlJc w:val="left"/>
+      <w:pPr>
+        <w:ind w:left="1440" w:hanging="360"/>
+      </w:pPr>
+      <w:rPr>
+        <w:rFonts w:ascii="Courier New" w:hAnsi="Courier New" w:cs="Courier New" w:hint="default"/>
+      </w:rPr>
+    </w:lvl>
+    <w:lvl w:ilvl="2" w:tplc="04090005" w:tentative="1">
+      <w:start w:val="1"/>
+      <w:numFmt w:val="bullet"/>
+      <w:lvlText w:val=""/>
+      <w:lvlJc w:val="left"/>
+      <w:pPr>
+        <w:ind w:left="2160" w:hanging="360"/>
+      </w:pPr>
+      <w:rPr>
+        <w:rFonts w:ascii="Wingdings" w:hAnsi="Wingdings" w:hint="default"/>
+      </w:rPr>
+    </w:lvl>
+    <w:lvl w:ilvl="3" w:tplc="04090001" w:tentative="1">
+      <w:start w:val="1"/>
+      <w:numFmt w:val="bullet"/>
+      <w:lvlText w:val=""/>
+      <w:lvlJc w:val="left"/>
+      <w:pPr>
+        <w:ind w:left="2880" w:hanging="360"/>
+      </w:pPr>
+      <w:rPr>
+        <w:rFonts w:ascii="Symbol" w:hAnsi="Symbol" w:hint="default"/>
+      </w:rPr>
+    </w:lvl>
+    <w:lvl w:ilvl="4" w:tplc="04090003" w:tentative="1">
+      <w:start w:val="1"/>
+      <w:numFmt w:val="bullet"/>
+      <w:lvlText w:val="o"/>
+      <w:lvlJc w:val="left"/>
+      <w:pPr>
+        <w:ind w:left="3600" w:hanging="360"/>
+      </w:pPr>
+      <w:rPr>
+        <w:rFonts w:ascii="Courier New" w:hAnsi="Courier New" w:cs="Courier New" w:hint="default"/>
+      </w:rPr>
+    </w:lvl>
+    <w:lvl w:ilvl="5" w:tplc="04090005" w:tentative="1">
+      <w:start w:val="1"/>
+      <w:numFmt w:val="bullet"/>
+      <w:lvlText w:val=""/>
+      <w:lvlJc w:val="left"/>
+      <w:pPr>
+        <w:ind w:left="4320" w:hanging="360"/>
+      </w:pPr>
+      <w:rPr>
+        <w:rFonts w:ascii="Wingdings" w:hAnsi="Wingdings" w:hint="default"/>
+      </w:rPr>
+    </w:lvl>
+    <w:lvl w:ilvl="6" w:tplc="04090001" w:tentative="1">
+      <w:start w:val="1"/>
+      <w:numFmt w:val="bullet"/>
+      <w:lvlText w:val=""/>
+      <w:lvlJc w:val="left"/>
+      <w:pPr>
+        <w:ind w:left="5040" w:hanging="360"/>
+      </w:pPr>
+      <w:rPr>
+        <w:rFonts w:ascii="Symbol" w:hAnsi="Symbol" w:hint="default"/>
+      </w:rPr>
+    </w:lvl>
+    <w:lvl w:ilvl="7" w:tplc="04090003" w:tentative="1">
+      <w:start w:val="1"/>
+      <w:numFmt w:val="bullet"/>
+      <w:lvlText w:val="o"/>
+      <w:lvlJc w:val="left"/>
+      <w:pPr>
+        <w:ind w:left="5760" w:hanging="360"/>
+      </w:pPr>
+      <w:rPr>
+        <w:rFonts w:ascii="Courier New" w:hAnsi="Courier New" w:cs="Courier New" w:hint="default"/>
+      </w:rPr>
+    </w:lvl>
+    <w:lvl w:ilvl="8" w:tplc="04090005" w:tentative="1">
+      <w:start w:val="1"/>
+      <w:numFmt w:val="bullet"/>
+      <w:lvlText w:val=""/>
+      <w:lvlJc w:val="left"/>
+      <w:pPr>
+        <w:ind w:left="6480" w:hanging="360"/>
+      </w:pPr>
+      <w:rPr>
+        <w:rFonts w:ascii="Wingdings" w:hAnsi="Wingdings" w:hint="default"/>
+      </w:rPr>
+    </w:lvl>
+  </w:abstractNum>
+  <w:abstractNum w:abstractNumId="4" w15:restartNumberingAfterBreak="0">
     <w:nsid w:val="7FF40CF5"/>
     <w:multiLevelType w:val="hybridMultilevel"/>
     <w:tmpl w:val="60ECB7C8"/>
@@ -1386,13 +2218,19 @@
     </w:lvl>
   </w:abstractNum>
   <w:num w:numId="1" w16cid:durableId="1632980190">
-    <w:abstractNumId w:val="1"/>
+    <w:abstractNumId w:val="2"/>
   </w:num>
   <w:num w:numId="2" w16cid:durableId="341517863">
     <w:abstractNumId w:val="0"/>
   </w:num>
   <w:num w:numId="3" w16cid:durableId="1070931303">
-    <w:abstractNumId w:val="2"/>
+    <w:abstractNumId w:val="4"/>
+  </w:num>
+  <w:num w:numId="4" w16cid:durableId="1858420008">
+    <w:abstractNumId w:val="3"/>
+  </w:num>
+  <w:num w:numId="5" w16cid:durableId="1465586887">
+    <w:abstractNumId w:val="1"/>
   </w:num>
 </w:numbering>
 </file>

</xml_diff>

<commit_message>
V19: Reviewed and finished 180-192 (+minor formatting fixes)
</commit_message>
<xml_diff>
--- a/Proof Reading and Review/LARA Bonecas Russas - Errata_v3 (129-136, 145-160, 191-207).docx
+++ b/Proof Reading and Review/LARA Bonecas Russas - Errata_v3 (129-136, 145-160, 191-207).docx
@@ -588,7 +588,6 @@
               </w:rPr>
             </w:pPr>
             <w:proofErr w:type="spellStart"/>
-            <w:proofErr w:type="gramStart"/>
             <w:r>
               <w:rPr>
                 <w:rFonts w:ascii="Times" w:eastAsia="Times" w:hAnsi="Times" w:cs="Times"/>
@@ -596,7 +595,6 @@
               <w:t>B.Cl</w:t>
             </w:r>
             <w:proofErr w:type="spellEnd"/>
-            <w:proofErr w:type="gramEnd"/>
           </w:p>
         </w:tc>
         <w:tc>
@@ -727,21 +725,7 @@
               <w:rPr>
                 <w:rFonts w:ascii="Times" w:eastAsia="Times" w:hAnsi="Times" w:cs="Times"/>
               </w:rPr>
-              <w:t xml:space="preserve"> </w:t>
-            </w:r>
-            <w:proofErr w:type="gramStart"/>
-            <w:r>
-              <w:rPr>
-                <w:rFonts w:ascii="Times" w:eastAsia="Times" w:hAnsi="Times" w:cs="Times"/>
-              </w:rPr>
-              <w:t>notes</w:t>
-            </w:r>
-            <w:proofErr w:type="gramEnd"/>
-            <w:r>
-              <w:rPr>
-                <w:rFonts w:ascii="Times" w:eastAsia="Times" w:hAnsi="Times" w:cs="Times"/>
-              </w:rPr>
-              <w:t xml:space="preserve"> right?</w:t>
+              <w:t xml:space="preserve"> notes right?</w:t>
             </w:r>
           </w:p>
         </w:tc>
@@ -784,7 +768,7 @@
               <w:rPr>
                 <w:rFonts w:ascii="Times" w:eastAsia="Times" w:hAnsi="Times" w:cs="Times"/>
               </w:rPr>
-              <w:t>Voice</w:t>
+              <w:t>Bass Clarinet</w:t>
             </w:r>
           </w:p>
         </w:tc>
@@ -803,7 +787,7 @@
               <w:rPr>
                 <w:rFonts w:ascii="Times" w:eastAsia="Times" w:hAnsi="Times" w:cs="Times"/>
               </w:rPr>
-              <w:t>193-194</w:t>
+              <w:t>181</w:t>
             </w:r>
           </w:p>
         </w:tc>
@@ -822,7 +806,19 @@
               <w:rPr>
                 <w:rFonts w:ascii="Times" w:eastAsia="Times" w:hAnsi="Times" w:cs="Times"/>
               </w:rPr>
-              <w:t>Should these notes also have accent and staccato like trumpet and bass clarinet?</w:t>
+              <w:t xml:space="preserve">Is </w:t>
+            </w:r>
+            <w:r>
+              <w:rPr>
+                <w:rFonts w:ascii="Times" w:eastAsia="Times" w:hAnsi="Times" w:cs="Times"/>
+              </w:rPr>
+              <w:t xml:space="preserve">there </w:t>
+            </w:r>
+            <w:r>
+              <w:rPr>
+                <w:rFonts w:ascii="Times" w:eastAsia="Times" w:hAnsi="Times" w:cs="Times"/>
+              </w:rPr>
+              <w:t>meant to be a niente crescendo?</w:t>
             </w:r>
           </w:p>
         </w:tc>
@@ -837,12 +833,6 @@
                 <w:rFonts w:ascii="Times" w:eastAsia="Times" w:hAnsi="Times" w:cs="Times"/>
               </w:rPr>
             </w:pPr>
-            <w:r>
-              <w:rPr>
-                <w:rFonts w:ascii="Times" w:eastAsia="Times" w:hAnsi="Times" w:cs="Times"/>
-              </w:rPr>
-              <w:t>YES</w:t>
-            </w:r>
           </w:p>
         </w:tc>
       </w:tr>
@@ -859,17 +849,13 @@
             <w:pPr>
               <w:rPr>
                 <w:rFonts w:ascii="Times" w:eastAsia="Times" w:hAnsi="Times" w:cs="Times"/>
-                <w:b/>
-                <w:bCs/>
-              </w:rPr>
-            </w:pPr>
-            <w:r>
-              <w:rPr>
-                <w:rFonts w:ascii="Times" w:eastAsia="Times" w:hAnsi="Times" w:cs="Times"/>
-                <w:b/>
-                <w:bCs/>
-              </w:rPr>
-              <w:t>All</w:t>
+              </w:rPr>
+            </w:pPr>
+            <w:r>
+              <w:rPr>
+                <w:rFonts w:ascii="Times" w:eastAsia="Times" w:hAnsi="Times" w:cs="Times"/>
+              </w:rPr>
+              <w:t>Trombone</w:t>
             </w:r>
           </w:p>
         </w:tc>
@@ -882,17 +868,13 @@
             <w:pPr>
               <w:rPr>
                 <w:rFonts w:ascii="Times" w:eastAsia="Times" w:hAnsi="Times" w:cs="Times"/>
-                <w:b/>
-                <w:bCs/>
-              </w:rPr>
-            </w:pPr>
-            <w:r>
-              <w:rPr>
-                <w:rFonts w:ascii="Times" w:eastAsia="Times" w:hAnsi="Times" w:cs="Times"/>
-                <w:b/>
-                <w:bCs/>
-              </w:rPr>
-              <w:t>193-197</w:t>
+              </w:rPr>
+            </w:pPr>
+            <w:r>
+              <w:rPr>
+                <w:rFonts w:ascii="Times" w:eastAsia="Times" w:hAnsi="Times" w:cs="Times"/>
+              </w:rPr>
+              <w:t>184-195</w:t>
             </w:r>
           </w:p>
         </w:tc>
@@ -905,17 +887,49 @@
             <w:pPr>
               <w:rPr>
                 <w:rFonts w:ascii="Times" w:eastAsia="Times" w:hAnsi="Times" w:cs="Times"/>
-                <w:b/>
-                <w:bCs/>
-              </w:rPr>
-            </w:pPr>
-            <w:r>
-              <w:rPr>
-                <w:rFonts w:ascii="Times" w:eastAsia="Times" w:hAnsi="Times" w:cs="Times"/>
-                <w:b/>
-                <w:bCs/>
-              </w:rPr>
-              <w:t>I’ve put the rit. in the traditional style but I can also do the arrow style you have in the manuscript. Let me know if you prefer that or are okay with this.</w:t>
+              </w:rPr>
+            </w:pPr>
+            <w:r>
+              <w:rPr>
+                <w:rFonts w:ascii="Times" w:eastAsia="Times" w:hAnsi="Times" w:cs="Times"/>
+              </w:rPr>
+              <w:t>N</w:t>
+            </w:r>
+            <w:r>
+              <w:rPr>
+                <w:rFonts w:ascii="Times" w:eastAsia="Times" w:hAnsi="Times" w:cs="Times"/>
+              </w:rPr>
+              <w:t xml:space="preserve">otes </w:t>
+            </w:r>
+            <w:r>
+              <w:rPr>
+                <w:rFonts w:ascii="Times" w:eastAsia="Times" w:hAnsi="Times" w:cs="Times"/>
+              </w:rPr>
+              <w:t xml:space="preserve">are tied from </w:t>
+            </w:r>
+            <w:r>
+              <w:rPr>
+                <w:rFonts w:ascii="Times" w:eastAsia="Times" w:hAnsi="Times" w:cs="Times"/>
+              </w:rPr>
+              <w:t>E B to F Bb</w:t>
+            </w:r>
+            <w:r>
+              <w:rPr>
+                <w:rFonts w:ascii="Times" w:eastAsia="Times" w:hAnsi="Times" w:cs="Times"/>
+              </w:rPr>
+              <w:t xml:space="preserve"> across the measure</w:t>
+            </w:r>
+            <w:r>
+              <w:rPr>
+                <w:rFonts w:ascii="Times" w:eastAsia="Times" w:hAnsi="Times" w:cs="Times"/>
+              </w:rPr>
+              <w:t xml:space="preserve"> in the original manuscript.</w:t>
+            </w:r>
+            <w:r>
+              <w:rPr>
+                <w:rFonts w:ascii="Times" w:eastAsia="Times" w:hAnsi="Times" w:cs="Times"/>
+              </w:rPr>
+              <w:t xml:space="preserve"> Is there not meant to be a tie? </w:t>
             </w:r>
           </w:p>
         </w:tc>
@@ -928,18 +942,8 @@
             <w:pPr>
               <w:rPr>
                 <w:rFonts w:ascii="Times" w:eastAsia="Times" w:hAnsi="Times" w:cs="Times"/>
-                <w:b/>
-                <w:bCs/>
-              </w:rPr>
-            </w:pPr>
-            <w:r>
-              <w:rPr>
-                <w:rFonts w:ascii="Times" w:eastAsia="Times" w:hAnsi="Times" w:cs="Times"/>
-                <w:b/>
-                <w:bCs/>
-              </w:rPr>
-              <w:t>I prefer my arrows</w:t>
-            </w:r>
+              </w:rPr>
+            </w:pPr>
           </w:p>
         </w:tc>
       </w:tr>
@@ -962,7 +966,7 @@
               <w:rPr>
                 <w:rFonts w:ascii="Times" w:eastAsia="Times" w:hAnsi="Times" w:cs="Times"/>
               </w:rPr>
-              <w:t>All</w:t>
+              <w:t>Voice</w:t>
             </w:r>
           </w:p>
         </w:tc>
@@ -981,7 +985,7 @@
               <w:rPr>
                 <w:rFonts w:ascii="Times" w:eastAsia="Times" w:hAnsi="Times" w:cs="Times"/>
               </w:rPr>
-              <w:t>197</w:t>
+              <w:t>193-194</w:t>
             </w:r>
           </w:p>
         </w:tc>
@@ -1000,13 +1004,7 @@
               <w:rPr>
                 <w:rFonts w:ascii="Times" w:eastAsia="Times" w:hAnsi="Times" w:cs="Times"/>
               </w:rPr>
-              <w:t>Does</w:t>
-            </w:r>
-            <w:r>
-              <w:rPr>
-                <w:rFonts w:ascii="Times" w:eastAsia="Times" w:hAnsi="Times" w:cs="Times"/>
-              </w:rPr>
-              <w:t xml:space="preserve"> the fermata at the end of the bar have a specific timing?</w:t>
+              <w:t>Should these notes also have accent and staccato like trumpet and bass clarinet?</w:t>
             </w:r>
           </w:p>
         </w:tc>
@@ -1025,7 +1023,7 @@
               <w:rPr>
                 <w:rFonts w:ascii="Times" w:eastAsia="Times" w:hAnsi="Times" w:cs="Times"/>
               </w:rPr>
-              <w:t>3 seconds</w:t>
+              <w:t>YES</w:t>
             </w:r>
           </w:p>
         </w:tc>
@@ -1043,6 +1041,190 @@
             <w:pPr>
               <w:rPr>
                 <w:rFonts w:ascii="Times" w:eastAsia="Times" w:hAnsi="Times" w:cs="Times"/>
+                <w:b/>
+                <w:bCs/>
+              </w:rPr>
+            </w:pPr>
+            <w:r>
+              <w:rPr>
+                <w:rFonts w:ascii="Times" w:eastAsia="Times" w:hAnsi="Times" w:cs="Times"/>
+                <w:b/>
+                <w:bCs/>
+              </w:rPr>
+              <w:t>All</w:t>
+            </w:r>
+          </w:p>
+        </w:tc>
+        <w:tc>
+          <w:tcPr>
+            <w:tcW w:w="502" w:type="pct"/>
+            <w:vAlign w:val="center"/>
+          </w:tcPr>
+          <w:p>
+            <w:pPr>
+              <w:rPr>
+                <w:rFonts w:ascii="Times" w:eastAsia="Times" w:hAnsi="Times" w:cs="Times"/>
+                <w:b/>
+                <w:bCs/>
+              </w:rPr>
+            </w:pPr>
+            <w:r>
+              <w:rPr>
+                <w:rFonts w:ascii="Times" w:eastAsia="Times" w:hAnsi="Times" w:cs="Times"/>
+                <w:b/>
+                <w:bCs/>
+              </w:rPr>
+              <w:t>193-197</w:t>
+            </w:r>
+          </w:p>
+        </w:tc>
+        <w:tc>
+          <w:tcPr>
+            <w:tcW w:w="2493" w:type="pct"/>
+            <w:vAlign w:val="center"/>
+          </w:tcPr>
+          <w:p>
+            <w:pPr>
+              <w:rPr>
+                <w:rFonts w:ascii="Times" w:eastAsia="Times" w:hAnsi="Times" w:cs="Times"/>
+                <w:b/>
+                <w:bCs/>
+              </w:rPr>
+            </w:pPr>
+            <w:r>
+              <w:rPr>
+                <w:rFonts w:ascii="Times" w:eastAsia="Times" w:hAnsi="Times" w:cs="Times"/>
+                <w:b/>
+                <w:bCs/>
+              </w:rPr>
+              <w:t>I’ve put the rit. in the traditional style but I can also do the arrow style you have in the manuscript. Let me know if you prefer that or are okay with this.</w:t>
+            </w:r>
+          </w:p>
+        </w:tc>
+        <w:tc>
+          <w:tcPr>
+            <w:tcW w:w="1024" w:type="pct"/>
+            <w:vAlign w:val="center"/>
+          </w:tcPr>
+          <w:p>
+            <w:pPr>
+              <w:rPr>
+                <w:rFonts w:ascii="Times" w:eastAsia="Times" w:hAnsi="Times" w:cs="Times"/>
+                <w:b/>
+                <w:bCs/>
+              </w:rPr>
+            </w:pPr>
+            <w:r>
+              <w:rPr>
+                <w:rFonts w:ascii="Times" w:eastAsia="Times" w:hAnsi="Times" w:cs="Times"/>
+                <w:b/>
+                <w:bCs/>
+              </w:rPr>
+              <w:t>I prefer my arrows</w:t>
+            </w:r>
+          </w:p>
+        </w:tc>
+      </w:tr>
+      <w:tr>
+        <w:trPr>
+          <w:trHeight w:val="552"/>
+        </w:trPr>
+        <w:tc>
+          <w:tcPr>
+            <w:tcW w:w="981" w:type="pct"/>
+            <w:vAlign w:val="center"/>
+          </w:tcPr>
+          <w:p>
+            <w:pPr>
+              <w:rPr>
+                <w:rFonts w:ascii="Times" w:eastAsia="Times" w:hAnsi="Times" w:cs="Times"/>
+              </w:rPr>
+            </w:pPr>
+            <w:r>
+              <w:rPr>
+                <w:rFonts w:ascii="Times" w:eastAsia="Times" w:hAnsi="Times" w:cs="Times"/>
+              </w:rPr>
+              <w:t>All</w:t>
+            </w:r>
+          </w:p>
+        </w:tc>
+        <w:tc>
+          <w:tcPr>
+            <w:tcW w:w="502" w:type="pct"/>
+            <w:vAlign w:val="center"/>
+          </w:tcPr>
+          <w:p>
+            <w:pPr>
+              <w:rPr>
+                <w:rFonts w:ascii="Times" w:eastAsia="Times" w:hAnsi="Times" w:cs="Times"/>
+              </w:rPr>
+            </w:pPr>
+            <w:r>
+              <w:rPr>
+                <w:rFonts w:ascii="Times" w:eastAsia="Times" w:hAnsi="Times" w:cs="Times"/>
+              </w:rPr>
+              <w:t>197</w:t>
+            </w:r>
+          </w:p>
+        </w:tc>
+        <w:tc>
+          <w:tcPr>
+            <w:tcW w:w="2493" w:type="pct"/>
+            <w:vAlign w:val="center"/>
+          </w:tcPr>
+          <w:p>
+            <w:pPr>
+              <w:rPr>
+                <w:rFonts w:ascii="Times" w:eastAsia="Times" w:hAnsi="Times" w:cs="Times"/>
+              </w:rPr>
+            </w:pPr>
+            <w:r>
+              <w:rPr>
+                <w:rFonts w:ascii="Times" w:eastAsia="Times" w:hAnsi="Times" w:cs="Times"/>
+              </w:rPr>
+              <w:t>Does</w:t>
+            </w:r>
+            <w:r>
+              <w:rPr>
+                <w:rFonts w:ascii="Times" w:eastAsia="Times" w:hAnsi="Times" w:cs="Times"/>
+              </w:rPr>
+              <w:t xml:space="preserve"> the fermata at the end of the bar have a specific timing?</w:t>
+            </w:r>
+          </w:p>
+        </w:tc>
+        <w:tc>
+          <w:tcPr>
+            <w:tcW w:w="1024" w:type="pct"/>
+            <w:vAlign w:val="center"/>
+          </w:tcPr>
+          <w:p>
+            <w:pPr>
+              <w:rPr>
+                <w:rFonts w:ascii="Times" w:eastAsia="Times" w:hAnsi="Times" w:cs="Times"/>
+              </w:rPr>
+            </w:pPr>
+            <w:r>
+              <w:rPr>
+                <w:rFonts w:ascii="Times" w:eastAsia="Times" w:hAnsi="Times" w:cs="Times"/>
+              </w:rPr>
+              <w:t>3 seconds</w:t>
+            </w:r>
+          </w:p>
+        </w:tc>
+      </w:tr>
+      <w:tr>
+        <w:trPr>
+          <w:trHeight w:val="552"/>
+        </w:trPr>
+        <w:tc>
+          <w:tcPr>
+            <w:tcW w:w="981" w:type="pct"/>
+            <w:vAlign w:val="center"/>
+          </w:tcPr>
+          <w:p>
+            <w:pPr>
+              <w:rPr>
+                <w:rFonts w:ascii="Times" w:eastAsia="Times" w:hAnsi="Times" w:cs="Times"/>
               </w:rPr>
             </w:pPr>
             <w:r>
@@ -1222,7 +1404,6 @@
           <w:b/>
           <w:bCs/>
         </w:rPr>
-        <w:lastRenderedPageBreak/>
         <w:t>ADDITIONAL ERRATA – BATCH 3</w:t>
       </w:r>
     </w:p>
@@ -1267,15 +1448,7 @@
       </w:r>
       <w:proofErr w:type="spellEnd"/>
       <w:r>
-        <w:t>, beat 4 – last note is on the wrong octave</w:t>
-      </w:r>
-      <w:proofErr w:type="gramStart"/>
-      <w:r>
-        <w:t>….Eb</w:t>
-      </w:r>
-      <w:proofErr w:type="gramEnd"/>
-      <w:r>
-        <w:t xml:space="preserve"> should be an octave below</w:t>
+        <w:t>, beat 4 – last note is on the wrong octave….Eb should be an octave below</w:t>
       </w:r>
     </w:p>
     <w:p>
@@ -1321,17 +1494,12 @@
         <w:t xml:space="preserve">M129, </w:t>
       </w:r>
       <w:proofErr w:type="spellStart"/>
-      <w:proofErr w:type="gramStart"/>
       <w:r>
         <w:t>bcl</w:t>
       </w:r>
       <w:proofErr w:type="spellEnd"/>
       <w:r>
-        <w:t xml:space="preserve"> ,</w:t>
-      </w:r>
-      <w:proofErr w:type="gramEnd"/>
-      <w:r>
-        <w:t xml:space="preserve"> beat 3 missing natural; beat 4, wrong octave C1/4 flat should be one octave above</w:t>
+        <w:t xml:space="preserve"> , beat 3 missing natural; beat 4, wrong octave C1/4 flat should be one octave above</w:t>
       </w:r>
       <w:r>
         <w:br/>
@@ -1384,13 +1552,8 @@
       <w:r>
         <w:t>, beat 1, wrong transposition, should be A natural</w:t>
       </w:r>
-      <w:proofErr w:type="gramStart"/>
-      <w:r>
-        <w:t>….also</w:t>
-      </w:r>
-      <w:proofErr w:type="gramEnd"/>
-      <w:r>
-        <w:t xml:space="preserve"> beat 2 wrong transposition, should be C# 1/6 flat</w:t>
+      <w:r>
+        <w:t>….also beat 2 wrong transposition, should be C# 1/6 flat</w:t>
       </w:r>
     </w:p>
     <w:p>
@@ -1427,15 +1590,7 @@
       </w:r>
       <w:proofErr w:type="spellEnd"/>
       <w:r>
-        <w:t xml:space="preserve">” </w:t>
-      </w:r>
-      <w:proofErr w:type="gramStart"/>
-      <w:r>
-        <w:t>text  is</w:t>
-      </w:r>
-      <w:proofErr w:type="gramEnd"/>
-      <w:r>
-        <w:t xml:space="preserve"> chopped</w:t>
+        <w:t>” text  is chopped</w:t>
       </w:r>
     </w:p>
     <w:p>

</xml_diff>

<commit_message>
V20 - Minor edits to score, edits to lyrics. Re-org of folder
</commit_message>
<xml_diff>
--- a/Proof Reading and Review/LARA Bonecas Russas - Errata_v3 (129-136, 145-160, 191-207).docx
+++ b/Proof Reading and Review/LARA Bonecas Russas - Errata_v3 (129-136, 145-160, 191-207).docx
@@ -24,7 +24,6 @@
         <w:softHyphen/>
         <w:t xml:space="preserve">LARA </w:t>
       </w:r>
-      <w:proofErr w:type="spellStart"/>
       <w:r>
         <w:rPr>
           <w:rFonts w:ascii="Times" w:eastAsia="Times" w:hAnsi="Times" w:cs="Times"/>
@@ -33,31 +32,8 @@
           <w:sz w:val="40"/>
           <w:szCs w:val="40"/>
         </w:rPr>
-        <w:t>Bonecas</w:t>
-      </w:r>
-      <w:proofErr w:type="spellEnd"/>
-      <w:r>
-        <w:rPr>
-          <w:rFonts w:ascii="Times" w:eastAsia="Times" w:hAnsi="Times" w:cs="Times"/>
-          <w:b/>
-          <w:bCs/>
-          <w:sz w:val="40"/>
-          <w:szCs w:val="40"/>
-        </w:rPr>
-        <w:t xml:space="preserve"> </w:t>
-      </w:r>
-      <w:proofErr w:type="spellStart"/>
-      <w:r>
-        <w:rPr>
-          <w:rFonts w:ascii="Times" w:eastAsia="Times" w:hAnsi="Times" w:cs="Times"/>
-          <w:b/>
-          <w:bCs/>
-          <w:sz w:val="40"/>
-          <w:szCs w:val="40"/>
-        </w:rPr>
-        <w:t>Russas</w:t>
-      </w:r>
-      <w:proofErr w:type="spellEnd"/>
+        <w:t>Bonecas Russas</w:t>
+      </w:r>
     </w:p>
     <w:p>
       <w:pPr>
@@ -559,13 +535,11 @@
               </w:numPr>
               <w:rPr>
                 <w:rFonts w:ascii="Times" w:eastAsia="Times" w:hAnsi="Times" w:cs="Times"/>
-                <w:color w:val="FF0000"/>
-              </w:rPr>
-            </w:pPr>
-            <w:r>
-              <w:rPr>
-                <w:rFonts w:ascii="Times" w:eastAsia="Times" w:hAnsi="Times" w:cs="Times"/>
-                <w:color w:val="FF0000"/>
+              </w:rPr>
+            </w:pPr>
+            <w:r>
+              <w:rPr>
+                <w:rFonts w:ascii="Times" w:eastAsia="Times" w:hAnsi="Times" w:cs="Times"/>
               </w:rPr>
               <w:t>See Below</w:t>
             </w:r>
@@ -587,14 +561,12 @@
                 <w:rFonts w:ascii="Times" w:eastAsia="Times" w:hAnsi="Times" w:cs="Times"/>
               </w:rPr>
             </w:pPr>
-            <w:proofErr w:type="spellStart"/>
             <w:r>
               <w:rPr>
                 <w:rFonts w:ascii="Times" w:eastAsia="Times" w:hAnsi="Times" w:cs="Times"/>
               </w:rPr>
               <w:t>B.Cl</w:t>
             </w:r>
-            <w:proofErr w:type="spellEnd"/>
           </w:p>
         </w:tc>
         <w:tc>
@@ -1041,15 +1013,11 @@
             <w:pPr>
               <w:rPr>
                 <w:rFonts w:ascii="Times" w:eastAsia="Times" w:hAnsi="Times" w:cs="Times"/>
-                <w:b/>
-                <w:bCs/>
-              </w:rPr>
-            </w:pPr>
-            <w:r>
-              <w:rPr>
-                <w:rFonts w:ascii="Times" w:eastAsia="Times" w:hAnsi="Times" w:cs="Times"/>
-                <w:b/>
-                <w:bCs/>
+              </w:rPr>
+            </w:pPr>
+            <w:r>
+              <w:rPr>
+                <w:rFonts w:ascii="Times" w:eastAsia="Times" w:hAnsi="Times" w:cs="Times"/>
               </w:rPr>
               <w:t>All</w:t>
             </w:r>
@@ -1064,15 +1032,11 @@
             <w:pPr>
               <w:rPr>
                 <w:rFonts w:ascii="Times" w:eastAsia="Times" w:hAnsi="Times" w:cs="Times"/>
-                <w:b/>
-                <w:bCs/>
-              </w:rPr>
-            </w:pPr>
-            <w:r>
-              <w:rPr>
-                <w:rFonts w:ascii="Times" w:eastAsia="Times" w:hAnsi="Times" w:cs="Times"/>
-                <w:b/>
-                <w:bCs/>
+              </w:rPr>
+            </w:pPr>
+            <w:r>
+              <w:rPr>
+                <w:rFonts w:ascii="Times" w:eastAsia="Times" w:hAnsi="Times" w:cs="Times"/>
               </w:rPr>
               <w:t>193-197</w:t>
             </w:r>
@@ -1087,15 +1051,11 @@
             <w:pPr>
               <w:rPr>
                 <w:rFonts w:ascii="Times" w:eastAsia="Times" w:hAnsi="Times" w:cs="Times"/>
-                <w:b/>
-                <w:bCs/>
-              </w:rPr>
-            </w:pPr>
-            <w:r>
-              <w:rPr>
-                <w:rFonts w:ascii="Times" w:eastAsia="Times" w:hAnsi="Times" w:cs="Times"/>
-                <w:b/>
-                <w:bCs/>
+              </w:rPr>
+            </w:pPr>
+            <w:r>
+              <w:rPr>
+                <w:rFonts w:ascii="Times" w:eastAsia="Times" w:hAnsi="Times" w:cs="Times"/>
               </w:rPr>
               <w:t>I’ve put the rit. in the traditional style but I can also do the arrow style you have in the manuscript. Let me know if you prefer that or are okay with this.</w:t>
             </w:r>
@@ -1110,15 +1070,11 @@
             <w:pPr>
               <w:rPr>
                 <w:rFonts w:ascii="Times" w:eastAsia="Times" w:hAnsi="Times" w:cs="Times"/>
-                <w:b/>
-                <w:bCs/>
-              </w:rPr>
-            </w:pPr>
-            <w:r>
-              <w:rPr>
-                <w:rFonts w:ascii="Times" w:eastAsia="Times" w:hAnsi="Times" w:cs="Times"/>
-                <w:b/>
-                <w:bCs/>
+              </w:rPr>
+            </w:pPr>
+            <w:r>
+              <w:rPr>
+                <w:rFonts w:ascii="Times" w:eastAsia="Times" w:hAnsi="Times" w:cs="Times"/>
               </w:rPr>
               <w:t>I prefer my arrows</w:t>
             </w:r>
@@ -1316,7 +1272,6 @@
         <w:rPr>
           <w:b/>
           <w:bCs/>
-          <w:color w:val="FF0000"/>
           <w:lang w:val="pt-BR"/>
         </w:rPr>
       </w:pPr>
@@ -1324,7 +1279,6 @@
         <w:rPr>
           <w:b/>
           <w:bCs/>
-          <w:color w:val="FF0000"/>
           <w:lang w:val="pt-BR"/>
         </w:rPr>
         <w:t>Song</w:t>
@@ -1333,7 +1287,6 @@
         <w:rPr>
           <w:b/>
           <w:bCs/>
-          <w:color w:val="FF0000"/>
           <w:lang w:val="pt-BR"/>
         </w:rPr>
         <w:br/>
@@ -1343,13 +1296,11 @@
       <w:pPr>
         <w:pStyle w:val="ListParagraph"/>
         <w:rPr>
-          <w:color w:val="FF0000"/>
           <w:lang w:val="pt-BR"/>
         </w:rPr>
       </w:pPr>
       <w:r>
         <w:rPr>
-          <w:color w:val="FF0000"/>
           <w:lang w:val="pt-BR"/>
         </w:rPr>
         <w:t>Com olho dentro dos olhos observo teu corpo de manhã; com dedos dentro dos dedos toquei você ontem a noite. Minha saliva antiga bebeu a tua, não a nova, e em minha raiva foi meu veneno velho, copiado, diluído, que se lançou contra todos.</w:t>
@@ -1359,7 +1310,6 @@
       <w:pPr>
         <w:pStyle w:val="ListParagraph"/>
         <w:rPr>
-          <w:color w:val="FF0000"/>
           <w:lang w:val="pt-BR"/>
         </w:rPr>
       </w:pPr>
@@ -1370,14 +1320,12 @@
         <w:rPr>
           <w:i/>
           <w:iCs/>
-          <w:color w:val="FF0000"/>
         </w:rPr>
       </w:pPr>
       <w:r>
         <w:rPr>
           <w:i/>
           <w:iCs/>
-          <w:color w:val="FF0000"/>
         </w:rPr>
         <w:t>"With eye within eyes, I observe your body in the morning; with finger within fingers, I touched you last night. My old saliva drank yours, not the new one, and in my wrath was old poison, copied, diluted, which launched itself against all "</w:t>
       </w:r>
@@ -1440,15 +1388,7 @@
         </w:numPr>
       </w:pPr>
       <w:r>
-        <w:t xml:space="preserve">M128 – </w:t>
-      </w:r>
-      <w:proofErr w:type="spellStart"/>
-      <w:r>
-        <w:t>bcl</w:t>
-      </w:r>
-      <w:proofErr w:type="spellEnd"/>
-      <w:r>
-        <w:t>, beat 4 – last note is on the wrong octave….Eb should be an octave below</w:t>
+        <w:t>M128 – bcl, beat 4 – last note is on the wrong octave….Eb should be an octave below</w:t>
       </w:r>
     </w:p>
     <w:p>
@@ -1468,15 +1408,7 @@
         </w:numPr>
       </w:pPr>
       <w:r>
-        <w:t xml:space="preserve">M128, </w:t>
-      </w:r>
-      <w:proofErr w:type="spellStart"/>
-      <w:r>
-        <w:t>tbn</w:t>
-      </w:r>
-      <w:proofErr w:type="spellEnd"/>
-      <w:r>
-        <w:t>, beat 4 – change spelling from G# to Ab</w:t>
+        <w:t>M128, tbn, beat 4 – change spelling from G# to Ab</w:t>
       </w:r>
       <w:r>
         <w:br/>
@@ -1491,15 +1423,7 @@
         </w:numPr>
       </w:pPr>
       <w:r>
-        <w:t xml:space="preserve">M129, </w:t>
-      </w:r>
-      <w:proofErr w:type="spellStart"/>
-      <w:r>
-        <w:t>bcl</w:t>
-      </w:r>
-      <w:proofErr w:type="spellEnd"/>
-      <w:r>
-        <w:t xml:space="preserve"> , beat 3 missing natural; beat 4, wrong octave C1/4 flat should be one octave above</w:t>
+        <w:t>M129, bcl , beat 3 missing natural; beat 4, wrong octave C1/4 flat should be one octave above</w:t>
       </w:r>
       <w:r>
         <w:br/>
@@ -1514,15 +1438,7 @@
         </w:numPr>
       </w:pPr>
       <w:r>
-        <w:t xml:space="preserve">M129, </w:t>
-      </w:r>
-      <w:proofErr w:type="spellStart"/>
-      <w:r>
-        <w:t>tpt</w:t>
-      </w:r>
-      <w:proofErr w:type="spellEnd"/>
-      <w:r>
-        <w:t>, beat 3, note has not been transposed…should be A ¼ flat</w:t>
+        <w:t>M129, tpt, beat 3, note has not been transposed…should be A ¼ flat</w:t>
       </w:r>
     </w:p>
     <w:p>
@@ -1542,15 +1458,7 @@
         </w:numPr>
       </w:pPr>
       <w:r>
-        <w:t xml:space="preserve">M131, </w:t>
-      </w:r>
-      <w:proofErr w:type="spellStart"/>
-      <w:r>
-        <w:t>tpt</w:t>
-      </w:r>
-      <w:proofErr w:type="spellEnd"/>
-      <w:r>
-        <w:t>, beat 1, wrong transposition, should be A natural</w:t>
+        <w:t>M131, tpt, beat 1, wrong transposition, should be A natural</w:t>
       </w:r>
       <w:r>
         <w:t>….also beat 2 wrong transposition, should be C# 1/6 flat</w:t>
@@ -1574,23 +1482,7 @@
         </w:numPr>
       </w:pPr>
       <w:r>
-        <w:t xml:space="preserve">M133, </w:t>
-      </w:r>
-      <w:proofErr w:type="spellStart"/>
-      <w:r>
-        <w:t>tpt</w:t>
-      </w:r>
-      <w:proofErr w:type="spellEnd"/>
-      <w:r>
-        <w:t>, “</w:t>
-      </w:r>
-      <w:proofErr w:type="spellStart"/>
-      <w:r>
-        <w:t>ord</w:t>
-      </w:r>
-      <w:proofErr w:type="spellEnd"/>
-      <w:r>
-        <w:t>” text  is chopped</w:t>
+        <w:t>M133, tpt, “ord” text  is chopped</w:t>
       </w:r>
     </w:p>
     <w:p>
@@ -1632,15 +1524,7 @@
         </w:numPr>
       </w:pPr>
       <w:r>
-        <w:t xml:space="preserve">M150, </w:t>
-      </w:r>
-      <w:proofErr w:type="spellStart"/>
-      <w:r>
-        <w:t>tpt</w:t>
-      </w:r>
-      <w:proofErr w:type="spellEnd"/>
-      <w:r>
-        <w:t xml:space="preserve">, beat 3, F missing natural </w:t>
+        <w:t xml:space="preserve">M150, tpt, beat 3, F missing natural </w:t>
       </w:r>
     </w:p>
     <w:p>
@@ -1661,15 +1545,7 @@
         </w:numPr>
       </w:pPr>
       <w:r>
-        <w:t xml:space="preserve">M155, </w:t>
-      </w:r>
-      <w:proofErr w:type="spellStart"/>
-      <w:r>
-        <w:t>tpt</w:t>
-      </w:r>
-      <w:proofErr w:type="spellEnd"/>
-      <w:r>
-        <w:t>, beat 1 – wrong transposition, should be C natural</w:t>
+        <w:t>M155, tpt, beat 1 – wrong transposition, should be C natural</w:t>
       </w:r>
       <w:r>
         <w:t>; grace note also wrong, should be F ¼ sharp</w:t>
@@ -1693,15 +1569,7 @@
         </w:numPr>
       </w:pPr>
       <w:r>
-        <w:t xml:space="preserve">M156, </w:t>
-      </w:r>
-      <w:proofErr w:type="spellStart"/>
-      <w:r>
-        <w:t>tpt</w:t>
-      </w:r>
-      <w:proofErr w:type="spellEnd"/>
-      <w:r>
-        <w:t>, beats 1 and 2 both missing 1/6 flat to their accidentals</w:t>
+        <w:t>M156, tpt, beats 1 and 2 both missing 1/6 flat to their accidentals</w:t>
       </w:r>
     </w:p>
     <w:p>
@@ -1722,15 +1590,7 @@
         </w:numPr>
       </w:pPr>
       <w:r>
-        <w:t xml:space="preserve">M157, </w:t>
-      </w:r>
-      <w:proofErr w:type="spellStart"/>
-      <w:r>
-        <w:t>tpt</w:t>
-      </w:r>
-      <w:proofErr w:type="spellEnd"/>
-      <w:r>
-        <w:t>, missing dynamics</w:t>
+        <w:t>M157, tpt, missing dynamics</w:t>
       </w:r>
     </w:p>
     <w:p>
@@ -1751,15 +1611,7 @@
         </w:numPr>
       </w:pPr>
       <w:r>
-        <w:t xml:space="preserve">M159, </w:t>
-      </w:r>
-      <w:proofErr w:type="spellStart"/>
-      <w:r>
-        <w:t>bcl</w:t>
-      </w:r>
-      <w:proofErr w:type="spellEnd"/>
-      <w:r>
-        <w:t>, beat 3, clean up mf from crescendo clash</w:t>
+        <w:t>M159, bcl, beat 3, clean up mf from crescendo clash</w:t>
       </w:r>
     </w:p>
     <w:p>
@@ -1780,15 +1632,7 @@
         </w:numPr>
       </w:pPr>
       <w:r>
-        <w:t>From M193-197, voice, add text “</w:t>
-      </w:r>
-      <w:proofErr w:type="spellStart"/>
-      <w:r>
-        <w:t>tototo</w:t>
-      </w:r>
-      <w:proofErr w:type="spellEnd"/>
-      <w:r>
-        <w:t>…” under every group</w:t>
+        <w:t>From M193-197, voice, add text “tototo…” under every group</w:t>
       </w:r>
     </w:p>
     <w:p>
@@ -1815,15 +1659,7 @@
         <w:t>4</w:t>
       </w:r>
       <w:r>
-        <w:t xml:space="preserve">, </w:t>
-      </w:r>
-      <w:proofErr w:type="spellStart"/>
-      <w:r>
-        <w:t>tpt</w:t>
-      </w:r>
-      <w:proofErr w:type="spellEnd"/>
-      <w:r>
-        <w:t>, all notes are wrong…transposition should be C ¼ flat</w:t>
+        <w:t>, tpt, all notes are wrong…transposition should be C ¼ flat</w:t>
       </w:r>
     </w:p>
     <w:p>

</xml_diff>